<commit_message>
Use Copilot direct edits across Labs 2-6
</commit_message>
<xml_diff>
--- a/labs/lab-4/downloads/Lab_4_Tone_Profile_and_Change_Control_Template.docx
+++ b/labs/lab-4/downloads/Lab_4_Tone_Profile_and_Change_Control_Template.docx
@@ -2497,7 +2497,7 @@
                 <w:color w:val="2563EB"/>
                 <w:sz w:val="17"/>
               </w:rPr>
-              <w:t>PASTE APPROVED INSTRUCTION HERE</w:t>
+              <w:t>COPILOT WRITES THE APPROVED INSTRUCTION HERE</w:t>
               <w:br/>
             </w:r>
             <w:r>
@@ -2508,7 +2508,7 @@
                 <w:color w:val="1F2933"/>
                 <w:sz w:val="20"/>
               </w:rPr>
-              <w:t>Replace this text with the current complete instruction only after the individual rules and the controlled change have been approved.</w:t>
+              <w:t>Open this document with Edit with Copilot. Reference the scorecard and ask Copilot to write only accepted or edited rules after human approval. Preview before keeping the change.</w:t>
             </w:r>
           </w:p>
         </w:tc>

</xml_diff>